<commit_message>
Add evaluation report, architecture diagram; remove Parquet references
- Add EVALUATION_REPORT.md with metrics, feature importance, drift, and leakage prevention
- Add architecture diagram to README.md
- Replace all Parquet references with CSV across docs, build scripts, and slides
- Remove pyarrow from requirements.txt
- Regenerate DOCUMENTATION.docx, PITCH_DECK.pptx, ONE_PAGE_SUMMARY.pptx

Co-Authored-By: Claude Opus 4.6 <noreply@anthropic.com>
</commit_message>
<xml_diff>
--- a/DOCUMENTATION.docx
+++ b/DOCUMENTATION.docx
@@ -2267,7 +2267,7 @@
           <w:i w:val="0"/>
           <w:sz w:val="22"/>
         </w:rPr>
-        <w:t>ERP features (15) and note-derived features (2 used in model, 1 tracked) are merged into a unified feature store. The store is saved as Apache Parquet with a companion CSV file tracking lineage metadata (source, timestamps, freshness status) for every feature.</w:t>
+        <w:t>ERP features (15) and note-derived features (2 used in model, 1 tracked) are merged into a unified feature store. The store is saved as CSV with a companion CSV file tracking lineage metadata (source, timestamps, freshness status) for every feature.</w:t>
       </w:r>
     </w:p>
     <w:p>
@@ -4561,7 +4561,7 @@
     </w:p>
     <w:p>
       <w:r>
-        <w:t>The feature store uses Apache Parquet as its storage format:</w:t>
+        <w:t>The feature store uses CSV as its storage format:</w:t>
       </w:r>
     </w:p>
     <w:p>
@@ -4570,7 +4570,7 @@
         <w:ind w:left="680"/>
       </w:pPr>
       <w:r>
-        <w:t>Columnar format — reads only the columns needed, not entire rows</w:t>
+        <w:t>Universal format — readable by any tool, language, or spreadsheet application</w:t>
       </w:r>
     </w:p>
     <w:p>
@@ -4579,7 +4579,7 @@
         <w:ind w:left="680"/>
       </w:pPr>
       <w:r>
-        <w:t>Compressed — significantly smaller than CSV for numeric data</w:t>
+        <w:t>Human-readable — can be inspected directly without specialized software</w:t>
       </w:r>
     </w:p>
     <w:p>
@@ -4588,21 +4588,12 @@
         <w:ind w:left="680"/>
       </w:pPr>
       <w:r>
-        <w:t>Type-preserving — integers stay integers, dates stay dates (unlike CSV where everything is text)</w:t>
-      </w:r>
-    </w:p>
-    <w:p>
-      <w:pPr>
-        <w:pStyle w:val="ListBullet"/>
-        <w:ind w:left="680"/>
-      </w:pPr>
-      <w:r>
-        <w:t>Widely supported — pandas, Spark, Polars, and cloud services all read Parquet natively</w:t>
+        <w:t>Widely supported — pandas, Excel, cloud services, and databases all read CSV natively</w:t>
       </w:r>
     </w:p>
     <w:p>
       <w:r>
-        <w:t>The feature store is saved to data/feature_store.parquet. It contains one row per SKU per date with all 18 features and the target variable.</w:t>
+        <w:t>The feature store is saved to data/feature_store.csv. It contains one row per SKU per date with all 18 features and the target variable.</w:t>
       </w:r>
     </w:p>
     <w:p>
@@ -7247,7 +7238,7 @@
               <w:rPr>
                 <w:sz w:val="20"/>
               </w:rPr>
-              <w:t>Apache Parquet</w:t>
+              <w:t>CSV</w:t>
             </w:r>
           </w:p>
         </w:tc>
@@ -7261,7 +7252,7 @@
               <w:rPr>
                 <w:sz w:val="20"/>
               </w:rPr>
-              <w:t>Columnar storage for feature data with type preservation</w:t>
+              <w:t>Universal storage for feature data with lineage tracking</w:t>
             </w:r>
           </w:p>
         </w:tc>

</xml_diff>